<commit_message>
docs(REAMDE): Actualizar url carpetas.
</commit_message>
<xml_diff>
--- a/README.docx
+++ b/README.docx
@@ -5,12 +5,12 @@
     <w:p>
       <w:pPr>
         <w:rPr>
-          <w:rFonts w:ascii="Times New Roman" w:hAnsi="Times New Roman" w:eastAsia="Times New Roman" w:cs="Times New Roman"/>
-        </w:rPr>
-      </w:pPr>
-      <w:r>
-        <w:rPr>
-          <w:rFonts w:ascii="Times New Roman" w:hAnsi="Times New Roman" w:eastAsia="Times New Roman" w:cs="Times New Roman"/>
+          <w:rFonts w:ascii="Times New Roman" w:eastAsia="Times New Roman" w:hAnsi="Times New Roman" w:cs="Times New Roman"/>
+        </w:rPr>
+      </w:pPr>
+      <w:r>
+        <w:rPr>
+          <w:rFonts w:ascii="Times New Roman" w:eastAsia="Times New Roman" w:hAnsi="Times New Roman" w:cs="Times New Roman"/>
         </w:rPr>
         <w:t>Muy buen día/tarde/noche.</w:t>
       </w:r>
@@ -18,44 +18,36 @@
     <w:p>
       <w:pPr>
         <w:rPr>
-          <w:rFonts w:ascii="Times New Roman" w:hAnsi="Times New Roman" w:eastAsia="Times New Roman" w:cs="Times New Roman"/>
-        </w:rPr>
-      </w:pPr>
-    </w:p>
-    <w:p>
-      <w:pPr>
-        <w:rPr>
-          <w:rFonts w:ascii="Times New Roman" w:hAnsi="Times New Roman" w:eastAsia="Times New Roman" w:cs="Times New Roman"/>
-          <w:b w:val="1"/>
-          <w:bCs w:val="1"/>
-          <w:i w:val="1"/>
-          <w:iCs w:val="1"/>
+          <w:rFonts w:ascii="Times New Roman" w:eastAsia="Times New Roman" w:hAnsi="Times New Roman" w:cs="Times New Roman"/>
+        </w:rPr>
+      </w:pPr>
+    </w:p>
+    <w:p>
+      <w:pPr>
+        <w:rPr>
+          <w:rFonts w:ascii="Times New Roman" w:eastAsia="Times New Roman" w:hAnsi="Times New Roman" w:cs="Times New Roman"/>
+          <w:b/>
+          <w:bCs/>
+          <w:i/>
+          <w:iCs/>
           <w:color w:val="1D2125"/>
-          <w:sz w:val="22"/>
-          <w:szCs w:val="22"/>
-        </w:rPr>
-      </w:pPr>
-      <w:r>
-        <w:rPr>
-          <w:rFonts w:ascii="Times New Roman" w:hAnsi="Times New Roman" w:eastAsia="Times New Roman" w:cs="Times New Roman"/>
-        </w:rPr>
-        <w:t>A continuación,</w:t>
-      </w:r>
-      <w:r>
-        <w:rPr>
-          <w:rFonts w:ascii="Times New Roman" w:hAnsi="Times New Roman" w:eastAsia="Times New Roman" w:cs="Times New Roman"/>
-        </w:rPr>
-        <w:t xml:space="preserve"> adjunto evidencia</w:t>
-      </w:r>
-      <w:r>
-        <w:rPr>
-          <w:rFonts w:ascii="Times New Roman" w:hAnsi="Times New Roman" w:eastAsia="Times New Roman" w:cs="Times New Roman"/>
+        </w:rPr>
+      </w:pPr>
+      <w:r>
+        <w:rPr>
+          <w:rFonts w:ascii="Times New Roman" w:eastAsia="Times New Roman" w:hAnsi="Times New Roman" w:cs="Times New Roman"/>
+        </w:rPr>
+        <w:t>A continuación, adjunto evidencia</w:t>
+      </w:r>
+      <w:r>
+        <w:rPr>
+          <w:rFonts w:ascii="Times New Roman" w:eastAsia="Times New Roman" w:hAnsi="Times New Roman" w:cs="Times New Roman"/>
         </w:rPr>
         <w:t>:</w:t>
       </w:r>
       <w:r>
         <w:rPr>
-          <w:rFonts w:ascii="Times New Roman" w:hAnsi="Times New Roman" w:eastAsia="Times New Roman" w:cs="Times New Roman"/>
+          <w:rFonts w:ascii="Times New Roman" w:eastAsia="Times New Roman" w:hAnsi="Times New Roman" w:cs="Times New Roman"/>
         </w:rPr>
         <w:t xml:space="preserve"> </w:t>
       </w:r>
@@ -63,45 +55,39 @@
     <w:p>
       <w:pPr>
         <w:rPr>
-          <w:rFonts w:ascii="Times New Roman" w:hAnsi="Times New Roman" w:eastAsia="Times New Roman" w:cs="Times New Roman"/>
-          <w:b w:val="1"/>
-          <w:bCs w:val="1"/>
-          <w:i w:val="1"/>
-          <w:iCs w:val="1"/>
+          <w:rFonts w:ascii="Times New Roman" w:eastAsia="Times New Roman" w:hAnsi="Times New Roman" w:cs="Times New Roman"/>
+          <w:b/>
+          <w:bCs/>
+          <w:i/>
+          <w:iCs/>
           <w:color w:val="1D2125"/>
-          <w:sz w:val="22"/>
-          <w:szCs w:val="22"/>
-        </w:rPr>
-      </w:pPr>
-    </w:p>
-    <w:p>
-      <w:pPr>
-        <w:pStyle w:val="ListParagraph"/>
+        </w:rPr>
+      </w:pPr>
+    </w:p>
+    <w:p>
+      <w:pPr>
+        <w:pStyle w:val="Prrafodelista"/>
         <w:numPr>
           <w:ilvl w:val="0"/>
-          <w:numId w:val="2"/>
+          <w:numId w:val="1"/>
         </w:numPr>
         <w:rPr>
-          <w:rFonts w:ascii="Times New Roman" w:hAnsi="Times New Roman" w:eastAsia="Times New Roman" w:cs="Times New Roman"/>
-          <w:b w:val="1"/>
-          <w:bCs w:val="1"/>
-          <w:i w:val="1"/>
-          <w:iCs w:val="1"/>
+          <w:rFonts w:ascii="Times New Roman" w:eastAsia="Times New Roman" w:hAnsi="Times New Roman" w:cs="Times New Roman"/>
+          <w:b/>
+          <w:bCs/>
+          <w:i/>
+          <w:iCs/>
           <w:color w:val="1D2125"/>
-          <w:sz w:val="22"/>
-          <w:szCs w:val="22"/>
-        </w:rPr>
-      </w:pPr>
-      <w:r>
-        <w:rPr>
-          <w:rFonts w:ascii="Times New Roman" w:hAnsi="Times New Roman" w:eastAsia="Times New Roman" w:cs="Times New Roman"/>
-          <w:b w:val="1"/>
-          <w:bCs w:val="1"/>
-          <w:i w:val="1"/>
-          <w:iCs w:val="1"/>
+        </w:rPr>
+      </w:pPr>
+      <w:r>
+        <w:rPr>
+          <w:rFonts w:ascii="Times New Roman" w:eastAsia="Times New Roman" w:hAnsi="Times New Roman" w:cs="Times New Roman"/>
+          <w:b/>
+          <w:bCs/>
+          <w:i/>
+          <w:iCs/>
           <w:color w:val="1D2125"/>
-          <w:sz w:val="22"/>
-          <w:szCs w:val="22"/>
         </w:rPr>
         <w:t>GA1-220501092-AA5-EV01-EV02.</w:t>
       </w:r>
@@ -109,108 +95,29 @@
     <w:p>
       <w:pPr>
         <w:rPr>
-          <w:rFonts w:ascii="Times New Roman" w:hAnsi="Times New Roman" w:eastAsia="Times New Roman" w:cs="Times New Roman"/>
-          <w:b w:val="0"/>
-          <w:bCs w:val="0"/>
-          <w:i w:val="0"/>
-          <w:iCs w:val="0"/>
-          <w:sz w:val="22"/>
-          <w:szCs w:val="22"/>
-        </w:rPr>
-      </w:pPr>
-    </w:p>
-    <w:p>
-      <w:pPr>
-        <w:rPr>
-          <w:rFonts w:ascii="Times New Roman" w:hAnsi="Times New Roman" w:eastAsia="Times New Roman" w:cs="Times New Roman"/>
-          <w:lang w:val="en-US"/>
-        </w:rPr>
-      </w:pPr>
-      <w:r>
-        <w:rPr>
-          <w:rFonts w:ascii="Times New Roman" w:hAnsi="Times New Roman" w:eastAsia="Times New Roman" w:cs="Times New Roman"/>
-          <w:lang w:val="en-US"/>
-        </w:rPr>
-        <w:t xml:space="preserve">URL </w:t>
-      </w:r>
-      <w:r>
-        <w:rPr>
-          <w:rFonts w:ascii="Times New Roman" w:hAnsi="Times New Roman" w:eastAsia="Times New Roman" w:cs="Times New Roman"/>
-          <w:lang w:val="en-US"/>
-        </w:rPr>
-        <w:t xml:space="preserve">Drive: </w:t>
-      </w:r>
-      <w:hyperlink r:id="R4d3ccf457e004175">
+          <w:rFonts w:ascii="Times New Roman" w:eastAsia="Times New Roman" w:hAnsi="Times New Roman" w:cs="Times New Roman"/>
+        </w:rPr>
+      </w:pPr>
+    </w:p>
+    <w:p>
+      <w:pPr>
+        <w:rPr>
+          <w:rFonts w:ascii="Times New Roman" w:eastAsia="Times New Roman" w:hAnsi="Times New Roman" w:cs="Times New Roman"/>
+          <w:lang w:val="es-ES"/>
+        </w:rPr>
+      </w:pPr>
+      <w:r>
+        <w:rPr>
+          <w:rFonts w:ascii="Times New Roman" w:eastAsia="Times New Roman" w:hAnsi="Times New Roman" w:cs="Times New Roman"/>
+          <w:lang w:val="es-ES"/>
+        </w:rPr>
+        <w:t xml:space="preserve">URL GitHub: </w:t>
+      </w:r>
+      <w:hyperlink r:id="rId5">
         <w:r>
           <w:rPr>
             <w:rStyle w:val="Hipervnculo"/>
-            <w:rFonts w:ascii="Times New Roman" w:hAnsi="Times New Roman" w:eastAsia="Times New Roman" w:cs="Times New Roman"/>
-            <w:lang w:val="en-US"/>
-          </w:rPr>
-          <w:t>Proyecto_Eien</w:t>
-        </w:r>
-        <w:r>
-          <w:rPr>
-            <w:rStyle w:val="Hipervnculo"/>
-            <w:rFonts w:ascii="Times New Roman" w:hAnsi="Times New Roman" w:eastAsia="Times New Roman" w:cs="Times New Roman"/>
-            <w:lang w:val="en-US"/>
-          </w:rPr>
-          <w:t>-System (</w:t>
-        </w:r>
-        <w:r>
-          <w:rPr>
-            <w:rStyle w:val="Hipervnculo"/>
-            <w:rFonts w:ascii="Times New Roman" w:hAnsi="Times New Roman" w:eastAsia="Times New Roman" w:cs="Times New Roman"/>
-            <w:lang w:val="en-US"/>
-          </w:rPr>
-          <w:t>永遠</w:t>
-        </w:r>
-        <w:r>
-          <w:rPr>
-            <w:rStyle w:val="Hipervnculo"/>
-            <w:rFonts w:ascii="Times New Roman" w:hAnsi="Times New Roman" w:eastAsia="Times New Roman" w:cs="Times New Roman"/>
-            <w:lang w:val="en-US"/>
-          </w:rPr>
-          <w:t>)</w:t>
-        </w:r>
-      </w:hyperlink>
-    </w:p>
-    <w:p>
-      <w:pPr>
-        <w:pStyle w:val="Normal"/>
-        <w:suppressLineNumbers w:val="0"/>
-        <w:bidi w:val="0"/>
-        <w:spacing w:before="0" w:beforeAutospacing="off" w:after="0" w:afterAutospacing="off" w:line="276" w:lineRule="auto"/>
-        <w:ind w:left="0" w:right="0"/>
-        <w:jc w:val="left"/>
-        <w:rPr>
-          <w:rFonts w:ascii="Times New Roman" w:hAnsi="Times New Roman" w:eastAsia="Times New Roman" w:cs="Times New Roman"/>
-          <w:noProof w:val="0"/>
-          <w:sz w:val="22"/>
-          <w:szCs w:val="22"/>
-          <w:lang w:val="es-ES"/>
-        </w:rPr>
-      </w:pPr>
-      <w:r>
-        <w:rPr>
-          <w:rFonts w:ascii="Times New Roman" w:hAnsi="Times New Roman" w:eastAsia="Times New Roman" w:cs="Times New Roman"/>
-          <w:lang w:val="es-ES"/>
-        </w:rPr>
-        <w:t>URL</w:t>
-      </w:r>
-      <w:r>
-        <w:rPr>
-          <w:rFonts w:ascii="Times New Roman" w:hAnsi="Times New Roman" w:eastAsia="Times New Roman" w:cs="Times New Roman"/>
-          <w:lang w:val="es-ES"/>
-        </w:rPr>
-        <w:t xml:space="preserve"> GitHub: </w:t>
-      </w:r>
-      <w:hyperlink r:id="R2997c04a5b9b4ba2">
-        <w:r>
-          <w:rPr>
-            <w:rStyle w:val="Hipervnculo"/>
-            <w:rFonts w:ascii="Times New Roman" w:hAnsi="Times New Roman" w:eastAsia="Times New Roman" w:cs="Times New Roman"/>
-            <w:noProof w:val="0"/>
+            <w:rFonts w:ascii="Times New Roman" w:eastAsia="Times New Roman" w:hAnsi="Times New Roman" w:cs="Times New Roman"/>
             <w:lang w:val="es-ES"/>
           </w:rPr>
           <w:t>Ze-ni-tsu (Meyer, Alejandro)</w:t>
@@ -219,116 +126,124 @@
     </w:p>
     <w:p>
       <w:pPr>
-        <w:pStyle w:val="Normal"/>
-        <w:suppressLineNumbers w:val="0"/>
-        <w:spacing w:before="0" w:beforeAutospacing="off" w:after="0" w:afterAutospacing="off" w:line="276" w:lineRule="auto"/>
-        <w:ind w:left="0" w:right="0"/>
-        <w:jc w:val="left"/>
-        <w:rPr>
-          <w:rFonts w:ascii="Times New Roman" w:hAnsi="Times New Roman" w:eastAsia="Times New Roman" w:cs="Times New Roman"/>
-          <w:noProof w:val="0"/>
-          <w:sz w:val="22"/>
-          <w:szCs w:val="22"/>
+        <w:rPr>
+          <w:rFonts w:ascii="Times New Roman" w:eastAsia="Times New Roman" w:hAnsi="Times New Roman" w:cs="Times New Roman"/>
           <w:lang w:val="en-US"/>
         </w:rPr>
       </w:pPr>
       <w:r>
         <w:rPr>
-          <w:rFonts w:ascii="Times New Roman" w:hAnsi="Times New Roman" w:eastAsia="Times New Roman" w:cs="Times New Roman"/>
+          <w:rFonts w:ascii="Times New Roman" w:eastAsia="Times New Roman" w:hAnsi="Times New Roman" w:cs="Times New Roman"/>
           <w:lang w:val="en-US"/>
         </w:rPr>
         <w:t xml:space="preserve">URL </w:t>
       </w:r>
       <w:r>
         <w:rPr>
-          <w:rFonts w:ascii="Times New Roman" w:hAnsi="Times New Roman" w:eastAsia="Times New Roman" w:cs="Times New Roman"/>
+          <w:rFonts w:ascii="Times New Roman" w:eastAsia="Times New Roman" w:hAnsi="Times New Roman" w:cs="Times New Roman"/>
           <w:lang w:val="en-US"/>
         </w:rPr>
-        <w:t xml:space="preserve">GitHub </w:t>
-      </w:r>
-      <w:r>
-        <w:rPr>
-          <w:rFonts w:ascii="Times New Roman" w:hAnsi="Times New Roman" w:eastAsia="Times New Roman" w:cs="Times New Roman"/>
-          <w:lang w:val="en-US"/>
-        </w:rPr>
-        <w:t>Proyecto</w:t>
-      </w:r>
-      <w:r>
-        <w:rPr>
-          <w:rFonts w:ascii="Times New Roman" w:hAnsi="Times New Roman" w:eastAsia="Times New Roman" w:cs="Times New Roman"/>
-          <w:lang w:val="en-US"/>
-        </w:rPr>
-        <w:t xml:space="preserve">: </w:t>
-      </w:r>
-      <w:hyperlink r:id="R486c51c47c794cba">
+        <w:t xml:space="preserve">Drive: </w:t>
+      </w:r>
+      <w:hyperlink r:id="rId6" w:history="1">
         <w:r>
           <w:rPr>
             <w:rStyle w:val="Hipervnculo"/>
-            <w:rFonts w:ascii="Times New Roman" w:hAnsi="Times New Roman" w:eastAsia="Times New Roman" w:cs="Times New Roman"/>
-            <w:noProof w:val="0"/>
-            <w:lang w:val="en-US"/>
+            <w:rFonts w:ascii="Times New Roman" w:hAnsi="Times New Roman" w:cs="Times New Roman"/>
           </w:rPr>
-          <w:t>Ze-ni-tsu/Eien-System: Proyecto Tecnólogo SENA 2025 - 2027</w:t>
+          <w:t>Eien-System Ft Sena</w:t>
         </w:r>
       </w:hyperlink>
     </w:p>
     <w:p>
       <w:pPr>
-        <w:pStyle w:val="Normal"/>
-        <w:suppressLineNumbers w:val="0"/>
-        <w:bidi w:val="0"/>
-        <w:spacing w:before="0" w:beforeAutospacing="off" w:after="0" w:afterAutospacing="off" w:line="276" w:lineRule="auto"/>
-        <w:ind w:left="0" w:right="0"/>
-        <w:jc w:val="left"/>
-        <w:rPr>
-          <w:rFonts w:ascii="Times New Roman" w:hAnsi="Times New Roman" w:eastAsia="Times New Roman" w:cs="Times New Roman"/>
+        <w:rPr>
+          <w:rFonts w:ascii="Times New Roman" w:eastAsia="Times New Roman" w:hAnsi="Times New Roman" w:cs="Times New Roman"/>
           <w:lang w:val="en-US"/>
         </w:rPr>
       </w:pPr>
       <w:r>
         <w:rPr>
-          <w:rFonts w:ascii="Times New Roman" w:hAnsi="Times New Roman" w:eastAsia="Times New Roman" w:cs="Times New Roman"/>
+          <w:rFonts w:ascii="Times New Roman" w:eastAsia="Times New Roman" w:hAnsi="Times New Roman" w:cs="Times New Roman"/>
           <w:lang w:val="en-US"/>
         </w:rPr>
         <w:t xml:space="preserve">URL </w:t>
       </w:r>
       <w:r>
         <w:rPr>
-          <w:rFonts w:ascii="Times New Roman" w:hAnsi="Times New Roman" w:eastAsia="Times New Roman" w:cs="Times New Roman"/>
+          <w:rFonts w:ascii="Times New Roman" w:eastAsia="Times New Roman" w:hAnsi="Times New Roman" w:cs="Times New Roman"/>
           <w:lang w:val="en-US"/>
         </w:rPr>
-        <w:t>Trello:</w:t>
-      </w:r>
-      <w:r>
-        <w:rPr>
-          <w:rFonts w:ascii="Times New Roman" w:hAnsi="Times New Roman" w:eastAsia="Times New Roman" w:cs="Times New Roman"/>
+        <w:t xml:space="preserve">GitHub </w:t>
+      </w:r>
+      <w:r>
+        <w:rPr>
+          <w:rFonts w:ascii="Times New Roman" w:eastAsia="Times New Roman" w:hAnsi="Times New Roman" w:cs="Times New Roman"/>
           <w:lang w:val="en-US"/>
         </w:rPr>
-        <w:t xml:space="preserve"> </w:t>
-      </w:r>
-      <w:hyperlink r:id="R0b47d134bd9b4d64">
+        <w:t>Proyecto</w:t>
+      </w:r>
+      <w:r>
+        <w:rPr>
+          <w:rFonts w:ascii="Times New Roman" w:eastAsia="Times New Roman" w:hAnsi="Times New Roman" w:cs="Times New Roman"/>
+          <w:lang w:val="en-US"/>
+        </w:rPr>
+        <w:t xml:space="preserve">: </w:t>
+      </w:r>
+      <w:hyperlink r:id="rId7" w:history="1">
         <w:r>
           <w:rPr>
             <w:rStyle w:val="Hipervnculo"/>
-            <w:rFonts w:ascii="Times New Roman" w:hAnsi="Times New Roman" w:eastAsia="Times New Roman" w:cs="Times New Roman"/>
+            <w:rFonts w:ascii="Times New Roman" w:eastAsia="Times New Roman" w:hAnsi="Times New Roman" w:cs="Times New Roman"/>
             <w:lang w:val="en-US"/>
           </w:rPr>
-          <w:t>Eien</w:t>
+          <w:t>Proyecto EIEN-SYSTEM</w:t>
         </w:r>
+      </w:hyperlink>
+    </w:p>
+    <w:p>
+      <w:pPr>
+        <w:rPr>
+          <w:rFonts w:ascii="Times New Roman" w:eastAsia="Times New Roman" w:hAnsi="Times New Roman" w:cs="Times New Roman"/>
+          <w:lang w:val="en-US"/>
+        </w:rPr>
+      </w:pPr>
+      <w:r>
+        <w:rPr>
+          <w:rFonts w:ascii="Times New Roman" w:eastAsia="Times New Roman" w:hAnsi="Times New Roman" w:cs="Times New Roman"/>
+          <w:lang w:val="en-US"/>
+        </w:rPr>
+        <w:t xml:space="preserve">URL </w:t>
+      </w:r>
+      <w:r>
+        <w:rPr>
+          <w:rFonts w:ascii="Times New Roman" w:eastAsia="Times New Roman" w:hAnsi="Times New Roman" w:cs="Times New Roman"/>
+          <w:lang w:val="en-US"/>
+        </w:rPr>
+        <w:t>Trello:</w:t>
+      </w:r>
+      <w:r>
+        <w:rPr>
+          <w:rFonts w:ascii="Times New Roman" w:eastAsia="Times New Roman" w:hAnsi="Times New Roman" w:cs="Times New Roman"/>
+          <w:lang w:val="en-US"/>
+        </w:rPr>
+        <w:t xml:space="preserve"> </w:t>
+      </w:r>
+      <w:hyperlink r:id="rId8">
         <w:r>
           <w:rPr>
             <w:rStyle w:val="Hipervnculo"/>
-            <w:rFonts w:ascii="Times New Roman" w:hAnsi="Times New Roman" w:eastAsia="Times New Roman" w:cs="Times New Roman"/>
+            <w:rFonts w:ascii="Times New Roman" w:eastAsia="Times New Roman" w:hAnsi="Times New Roman" w:cs="Times New Roman"/>
             <w:lang w:val="en-US"/>
           </w:rPr>
-          <w:t>-System Development | Trello</w:t>
+          <w:t>Eien-System Development | Trello</w:t>
         </w:r>
       </w:hyperlink>
     </w:p>
     <w:p>
       <w:pPr>
         <w:rPr>
-          <w:rFonts w:ascii="Times New Roman" w:hAnsi="Times New Roman" w:eastAsia="Times New Roman" w:cs="Times New Roman"/>
+          <w:rFonts w:ascii="Times New Roman" w:eastAsia="Times New Roman" w:hAnsi="Times New Roman" w:cs="Times New Roman"/>
           <w:lang w:val="en-US"/>
         </w:rPr>
       </w:pPr>
@@ -336,12 +251,12 @@
     <w:p>
       <w:pPr>
         <w:rPr>
-          <w:rFonts w:ascii="Times New Roman" w:hAnsi="Times New Roman" w:eastAsia="Times New Roman" w:cs="Times New Roman"/>
-        </w:rPr>
-      </w:pPr>
-      <w:r>
-        <w:rPr>
-          <w:rFonts w:ascii="Times New Roman" w:hAnsi="Times New Roman" w:eastAsia="Times New Roman" w:cs="Times New Roman"/>
+          <w:rFonts w:ascii="Times New Roman" w:eastAsia="Times New Roman" w:hAnsi="Times New Roman" w:cs="Times New Roman"/>
+        </w:rPr>
+      </w:pPr>
+      <w:r>
+        <w:rPr>
+          <w:rFonts w:ascii="Times New Roman" w:eastAsia="Times New Roman" w:hAnsi="Times New Roman" w:cs="Times New Roman"/>
         </w:rPr>
         <w:t>Muchas gracias por la paciencia.</w:t>
       </w:r>
@@ -349,19 +264,19 @@
     <w:p>
       <w:pPr>
         <w:rPr>
-          <w:rFonts w:ascii="Times New Roman" w:hAnsi="Times New Roman" w:eastAsia="Times New Roman" w:cs="Times New Roman"/>
-        </w:rPr>
-      </w:pPr>
-    </w:p>
-    <w:p>
-      <w:pPr>
-        <w:rPr>
-          <w:rFonts w:ascii="Times New Roman" w:hAnsi="Times New Roman" w:eastAsia="Times New Roman" w:cs="Times New Roman"/>
-        </w:rPr>
-      </w:pPr>
-      <w:r>
-        <w:rPr>
-          <w:rFonts w:ascii="Times New Roman" w:hAnsi="Times New Roman" w:eastAsia="Times New Roman" w:cs="Times New Roman"/>
+          <w:rFonts w:ascii="Times New Roman" w:eastAsia="Times New Roman" w:hAnsi="Times New Roman" w:cs="Times New Roman"/>
+        </w:rPr>
+      </w:pPr>
+    </w:p>
+    <w:p>
+      <w:pPr>
+        <w:rPr>
+          <w:rFonts w:ascii="Times New Roman" w:eastAsia="Times New Roman" w:hAnsi="Times New Roman" w:cs="Times New Roman"/>
+        </w:rPr>
+      </w:pPr>
+      <w:r>
+        <w:rPr>
+          <w:rFonts w:ascii="Times New Roman" w:eastAsia="Times New Roman" w:hAnsi="Times New Roman" w:cs="Times New Roman"/>
         </w:rPr>
         <w:t>Atentamente</w:t>
       </w:r>
@@ -369,43 +284,37 @@
     <w:p>
       <w:pPr>
         <w:rPr>
-          <w:rFonts w:ascii="Times New Roman" w:hAnsi="Times New Roman" w:eastAsia="Times New Roman" w:cs="Times New Roman"/>
-        </w:rPr>
-      </w:pPr>
-    </w:p>
-    <w:p>
-      <w:pPr>
-        <w:pStyle w:val="Normal"/>
-        <w:suppressLineNumbers w:val="0"/>
-        <w:bidi w:val="0"/>
-        <w:spacing w:before="0" w:beforeAutospacing="off" w:after="0" w:afterAutospacing="off" w:line="276" w:lineRule="auto"/>
-        <w:ind w:left="0" w:right="0"/>
-        <w:jc w:val="left"/>
-        <w:rPr>
-          <w:rFonts w:ascii="Times New Roman" w:hAnsi="Times New Roman" w:eastAsia="Times New Roman" w:cs="Times New Roman"/>
-          <w:b w:val="1"/>
-          <w:bCs w:val="1"/>
-        </w:rPr>
-      </w:pPr>
-      <w:r>
-        <w:rPr>
-          <w:rFonts w:ascii="Times New Roman" w:hAnsi="Times New Roman" w:eastAsia="Times New Roman" w:cs="Times New Roman"/>
-          <w:b w:val="1"/>
-          <w:bCs w:val="1"/>
+          <w:rFonts w:ascii="Times New Roman" w:eastAsia="Times New Roman" w:hAnsi="Times New Roman" w:cs="Times New Roman"/>
+        </w:rPr>
+      </w:pPr>
+    </w:p>
+    <w:p>
+      <w:pPr>
+        <w:rPr>
+          <w:rFonts w:ascii="Times New Roman" w:eastAsia="Times New Roman" w:hAnsi="Times New Roman" w:cs="Times New Roman"/>
+          <w:b/>
+          <w:bCs/>
+        </w:rPr>
+      </w:pPr>
+      <w:r>
+        <w:rPr>
+          <w:rFonts w:ascii="Times New Roman" w:eastAsia="Times New Roman" w:hAnsi="Times New Roman" w:cs="Times New Roman"/>
+          <w:b/>
+          <w:bCs/>
         </w:rPr>
         <w:t>Meyer</w:t>
       </w:r>
       <w:r>
         <w:rPr>
-          <w:rFonts w:ascii="Times New Roman" w:hAnsi="Times New Roman" w:eastAsia="Times New Roman" w:cs="Times New Roman"/>
+          <w:rFonts w:ascii="Times New Roman" w:eastAsia="Times New Roman" w:hAnsi="Times New Roman" w:cs="Times New Roman"/>
         </w:rPr>
         <w:t xml:space="preserve"> Romero, David </w:t>
       </w:r>
       <w:r>
         <w:rPr>
-          <w:rFonts w:ascii="Times New Roman" w:hAnsi="Times New Roman" w:eastAsia="Times New Roman" w:cs="Times New Roman"/>
-          <w:b w:val="1"/>
-          <w:bCs w:val="1"/>
+          <w:rFonts w:ascii="Times New Roman" w:eastAsia="Times New Roman" w:hAnsi="Times New Roman" w:cs="Times New Roman"/>
+          <w:b/>
+          <w:bCs/>
         </w:rPr>
         <w:t>Alejandro</w:t>
       </w:r>
@@ -413,54 +322,54 @@
     <w:p>
       <w:pPr>
         <w:rPr>
-          <w:rFonts w:ascii="Times New Roman" w:hAnsi="Times New Roman" w:eastAsia="Times New Roman" w:cs="Times New Roman"/>
-        </w:rPr>
-      </w:pPr>
-      <w:r>
-        <w:rPr>
-          <w:rFonts w:ascii="Times New Roman" w:hAnsi="Times New Roman" w:eastAsia="Times New Roman" w:cs="Times New Roman"/>
+          <w:rFonts w:ascii="Times New Roman" w:eastAsia="Times New Roman" w:hAnsi="Times New Roman" w:cs="Times New Roman"/>
+        </w:rPr>
+      </w:pPr>
+      <w:r>
+        <w:rPr>
+          <w:rFonts w:ascii="Times New Roman" w:eastAsia="Times New Roman" w:hAnsi="Times New Roman" w:cs="Times New Roman"/>
         </w:rPr>
         <w:t xml:space="preserve">Estudiante </w:t>
       </w:r>
       <w:r>
         <w:rPr>
-          <w:rFonts w:ascii="Times New Roman" w:hAnsi="Times New Roman" w:eastAsia="Times New Roman" w:cs="Times New Roman"/>
-          <w:b w:val="1"/>
-          <w:bCs w:val="1"/>
+          <w:rFonts w:ascii="Times New Roman" w:eastAsia="Times New Roman" w:hAnsi="Times New Roman" w:cs="Times New Roman"/>
+          <w:b/>
+          <w:bCs/>
         </w:rPr>
         <w:t>Tecnólogo</w:t>
       </w:r>
       <w:r>
         <w:rPr>
-          <w:rFonts w:ascii="Times New Roman" w:hAnsi="Times New Roman" w:eastAsia="Times New Roman" w:cs="Times New Roman"/>
+          <w:rFonts w:ascii="Times New Roman" w:eastAsia="Times New Roman" w:hAnsi="Times New Roman" w:cs="Times New Roman"/>
         </w:rPr>
         <w:t xml:space="preserve"> de </w:t>
       </w:r>
       <w:r>
         <w:rPr>
-          <w:rFonts w:ascii="Times New Roman" w:hAnsi="Times New Roman" w:eastAsia="Times New Roman" w:cs="Times New Roman"/>
-          <w:b w:val="1"/>
-          <w:bCs w:val="1"/>
+          <w:rFonts w:ascii="Times New Roman" w:eastAsia="Times New Roman" w:hAnsi="Times New Roman" w:cs="Times New Roman"/>
+          <w:b/>
+          <w:bCs/>
         </w:rPr>
         <w:t xml:space="preserve">Análisis y Desarrollo de Software </w:t>
       </w:r>
       <w:r>
         <w:rPr>
-          <w:rFonts w:ascii="Times New Roman" w:hAnsi="Times New Roman" w:eastAsia="Times New Roman" w:cs="Times New Roman"/>
+          <w:rFonts w:ascii="Times New Roman" w:eastAsia="Times New Roman" w:hAnsi="Times New Roman" w:cs="Times New Roman"/>
         </w:rPr>
         <w:t>(</w:t>
       </w:r>
       <w:r>
         <w:rPr>
-          <w:rFonts w:ascii="Times New Roman" w:hAnsi="Times New Roman" w:eastAsia="Times New Roman" w:cs="Times New Roman"/>
-          <w:b w:val="1"/>
-          <w:bCs w:val="1"/>
+          <w:rFonts w:ascii="Times New Roman" w:eastAsia="Times New Roman" w:hAnsi="Times New Roman" w:cs="Times New Roman"/>
+          <w:b/>
+          <w:bCs/>
         </w:rPr>
         <w:t>3336113</w:t>
       </w:r>
       <w:r>
         <w:rPr>
-          <w:rFonts w:ascii="Times New Roman" w:hAnsi="Times New Roman" w:eastAsia="Times New Roman" w:cs="Times New Roman"/>
+          <w:rFonts w:ascii="Times New Roman" w:eastAsia="Times New Roman" w:hAnsi="Times New Roman" w:cs="Times New Roman"/>
         </w:rPr>
         <w:t>)</w:t>
       </w:r>
@@ -468,12 +377,12 @@
     <w:p>
       <w:pPr>
         <w:rPr>
-          <w:rFonts w:ascii="Times New Roman" w:hAnsi="Times New Roman" w:eastAsia="Times New Roman" w:cs="Times New Roman"/>
-        </w:rPr>
-      </w:pPr>
-      <w:r>
-        <w:rPr>
-          <w:rFonts w:ascii="Times New Roman" w:hAnsi="Times New Roman" w:eastAsia="Times New Roman" w:cs="Times New Roman"/>
+          <w:rFonts w:ascii="Times New Roman" w:eastAsia="Times New Roman" w:hAnsi="Times New Roman" w:cs="Times New Roman"/>
+        </w:rPr>
+      </w:pPr>
+      <w:r>
+        <w:rPr>
+          <w:rFonts w:ascii="Times New Roman" w:eastAsia="Times New Roman" w:hAnsi="Times New Roman" w:cs="Times New Roman"/>
         </w:rPr>
         <w:t>SENA</w:t>
       </w:r>
@@ -481,19 +390,19 @@
     <w:p>
       <w:pPr>
         <w:rPr>
-          <w:rFonts w:ascii="Times New Roman" w:hAnsi="Times New Roman" w:eastAsia="Times New Roman" w:cs="Times New Roman"/>
-        </w:rPr>
-      </w:pPr>
-    </w:p>
-    <w:p>
-      <w:pPr>
-        <w:rPr>
-          <w:rFonts w:ascii="Times New Roman" w:hAnsi="Times New Roman" w:eastAsia="Times New Roman" w:cs="Times New Roman"/>
-        </w:rPr>
-      </w:pPr>
-      <w:r>
-        <w:rPr>
-          <w:rFonts w:ascii="Times New Roman" w:hAnsi="Times New Roman" w:eastAsia="Times New Roman" w:cs="Times New Roman"/>
+          <w:rFonts w:ascii="Times New Roman" w:eastAsia="Times New Roman" w:hAnsi="Times New Roman" w:cs="Times New Roman"/>
+        </w:rPr>
+      </w:pPr>
+    </w:p>
+    <w:p>
+      <w:pPr>
+        <w:rPr>
+          <w:rFonts w:ascii="Times New Roman" w:eastAsia="Times New Roman" w:hAnsi="Times New Roman" w:cs="Times New Roman"/>
+        </w:rPr>
+      </w:pPr>
+      <w:r>
+        <w:rPr>
+          <w:rFonts w:ascii="Times New Roman" w:eastAsia="Times New Roman" w:hAnsi="Times New Roman" w:cs="Times New Roman"/>
         </w:rPr>
         <w:t>Disclaimer:</w:t>
       </w:r>
@@ -501,119 +410,95 @@
     <w:p>
       <w:pPr>
         <w:rPr>
-          <w:rFonts w:ascii="Times New Roman" w:hAnsi="Times New Roman" w:eastAsia="Times New Roman" w:cs="Times New Roman"/>
-        </w:rPr>
-      </w:pPr>
-    </w:p>
-    <w:p>
-      <w:pPr>
-        <w:rPr>
-          <w:rFonts w:ascii="Times New Roman" w:hAnsi="Times New Roman" w:eastAsia="Times New Roman" w:cs="Times New Roman"/>
-          <w:b w:val="1"/>
-          <w:bCs w:val="1"/>
-        </w:rPr>
-      </w:pPr>
-      <w:r>
-        <w:rPr>
-          <w:rFonts w:ascii="Times New Roman" w:hAnsi="Times New Roman" w:eastAsia="Times New Roman" w:cs="Times New Roman"/>
+          <w:rFonts w:ascii="Times New Roman" w:eastAsia="Times New Roman" w:hAnsi="Times New Roman" w:cs="Times New Roman"/>
+        </w:rPr>
+      </w:pPr>
+    </w:p>
+    <w:p>
+      <w:pPr>
+        <w:rPr>
+          <w:rFonts w:ascii="Times New Roman" w:eastAsia="Times New Roman" w:hAnsi="Times New Roman" w:cs="Times New Roman"/>
+          <w:b/>
+          <w:bCs/>
+        </w:rPr>
+      </w:pPr>
+      <w:r>
+        <w:rPr>
+          <w:rFonts w:ascii="Times New Roman" w:eastAsia="Times New Roman" w:hAnsi="Times New Roman" w:cs="Times New Roman"/>
         </w:rPr>
         <w:t xml:space="preserve">Todos los documentos son realizados con el </w:t>
       </w:r>
       <w:r>
         <w:rPr>
-          <w:rFonts w:ascii="Times New Roman" w:hAnsi="Times New Roman" w:eastAsia="Times New Roman" w:cs="Times New Roman"/>
-          <w:b w:val="1"/>
-          <w:bCs w:val="1"/>
+          <w:rFonts w:ascii="Times New Roman" w:eastAsia="Times New Roman" w:hAnsi="Times New Roman" w:cs="Times New Roman"/>
+          <w:b/>
+          <w:bCs/>
         </w:rPr>
         <w:t>S</w:t>
       </w:r>
       <w:r>
         <w:rPr>
-          <w:rFonts w:ascii="Times New Roman" w:hAnsi="Times New Roman" w:eastAsia="Times New Roman" w:cs="Times New Roman"/>
-          <w:b w:val="1"/>
-          <w:bCs w:val="1"/>
+          <w:rFonts w:ascii="Times New Roman" w:eastAsia="Times New Roman" w:hAnsi="Times New Roman" w:cs="Times New Roman"/>
+          <w:b/>
+          <w:bCs/>
         </w:rPr>
         <w:t>oftware Office 365</w:t>
       </w:r>
       <w:r>
         <w:rPr>
-          <w:rFonts w:ascii="Times New Roman" w:hAnsi="Times New Roman" w:eastAsia="Times New Roman" w:cs="Times New Roman"/>
-          <w:b w:val="1"/>
-          <w:bCs w:val="1"/>
+          <w:rFonts w:ascii="Times New Roman" w:eastAsia="Times New Roman" w:hAnsi="Times New Roman" w:cs="Times New Roman"/>
+          <w:b/>
+          <w:bCs/>
         </w:rPr>
         <w:t>.</w:t>
       </w:r>
     </w:p>
     <w:p>
       <w:pPr>
-        <w:pStyle w:val="Normal"/>
-        <w:suppressLineNumbers w:val="0"/>
-        <w:bidi w:val="0"/>
-        <w:spacing w:before="0" w:beforeAutospacing="off" w:after="0" w:afterAutospacing="off" w:line="276" w:lineRule="auto"/>
-        <w:ind w:left="0" w:right="0"/>
-        <w:jc w:val="left"/>
-        <w:rPr>
-          <w:rFonts w:ascii="Times New Roman" w:hAnsi="Times New Roman" w:eastAsia="Times New Roman" w:cs="Times New Roman"/>
-          <w:b w:val="1"/>
-          <w:bCs w:val="1"/>
-        </w:rPr>
-      </w:pPr>
-      <w:r>
-        <w:rPr>
-          <w:rFonts w:ascii="Times New Roman" w:hAnsi="Times New Roman" w:eastAsia="Times New Roman" w:cs="Times New Roman"/>
-          <w:b w:val="0"/>
-          <w:bCs w:val="0"/>
-        </w:rPr>
-        <w:t xml:space="preserve">Versión Visual </w:t>
-      </w:r>
-      <w:r>
-        <w:rPr>
-          <w:rFonts w:ascii="Times New Roman" w:hAnsi="Times New Roman" w:eastAsia="Times New Roman" w:cs="Times New Roman"/>
-          <w:b w:val="0"/>
-          <w:bCs w:val="0"/>
-        </w:rPr>
-        <w:t>Paradigm</w:t>
-      </w:r>
-      <w:r>
-        <w:rPr>
-          <w:rFonts w:ascii="Times New Roman" w:hAnsi="Times New Roman" w:eastAsia="Times New Roman" w:cs="Times New Roman"/>
-          <w:b w:val="0"/>
-          <w:bCs w:val="0"/>
-        </w:rPr>
-        <w:t xml:space="preserve">: </w:t>
-      </w:r>
-      <w:r>
-        <w:rPr>
-          <w:rFonts w:ascii="Times New Roman" w:hAnsi="Times New Roman" w:eastAsia="Times New Roman" w:cs="Times New Roman"/>
-          <w:b w:val="1"/>
-          <w:bCs w:val="1"/>
-        </w:rPr>
-        <w:t>Online non-commercial</w:t>
-      </w:r>
-    </w:p>
-    <w:p>
-      <w:pPr>
-        <w:rPr>
-          <w:rFonts w:ascii="Times New Roman" w:hAnsi="Times New Roman" w:eastAsia="Times New Roman" w:cs="Times New Roman"/>
-        </w:rPr>
-      </w:pPr>
-      <w:r>
-        <w:rPr>
-          <w:rFonts w:ascii="Times New Roman" w:hAnsi="Times New Roman" w:eastAsia="Times New Roman" w:cs="Times New Roman"/>
-          <w:b w:val="1"/>
-          <w:bCs w:val="1"/>
+        <w:rPr>
+          <w:rFonts w:ascii="Times New Roman" w:eastAsia="Times New Roman" w:hAnsi="Times New Roman" w:cs="Times New Roman"/>
+          <w:b/>
+          <w:bCs/>
+        </w:rPr>
+      </w:pPr>
+      <w:r>
+        <w:rPr>
+          <w:rFonts w:ascii="Times New Roman" w:eastAsia="Times New Roman" w:hAnsi="Times New Roman" w:cs="Times New Roman"/>
+        </w:rPr>
+        <w:t xml:space="preserve">Versión Visual Paradigm: </w:t>
+      </w:r>
+      <w:r>
+        <w:rPr>
+          <w:rFonts w:ascii="Times New Roman" w:eastAsia="Times New Roman" w:hAnsi="Times New Roman" w:cs="Times New Roman"/>
+          <w:b/>
+          <w:bCs/>
+        </w:rPr>
+        <w:t>Visual Paradigm Community Edition</w:t>
+      </w:r>
+    </w:p>
+    <w:p>
+      <w:pPr>
+        <w:rPr>
+          <w:rFonts w:ascii="Times New Roman" w:eastAsia="Times New Roman" w:hAnsi="Times New Roman" w:cs="Times New Roman"/>
+        </w:rPr>
+      </w:pPr>
+      <w:r>
+        <w:rPr>
+          <w:rFonts w:ascii="Times New Roman" w:eastAsia="Times New Roman" w:hAnsi="Times New Roman" w:cs="Times New Roman"/>
+          <w:b/>
+          <w:bCs/>
         </w:rPr>
         <w:t>Licencia MIT</w:t>
       </w:r>
       <w:r>
         <w:rPr>
-          <w:rFonts w:ascii="Times New Roman" w:hAnsi="Times New Roman" w:eastAsia="Times New Roman" w:cs="Times New Roman"/>
+          <w:rFonts w:ascii="Times New Roman" w:eastAsia="Times New Roman" w:hAnsi="Times New Roman" w:cs="Times New Roman"/>
         </w:rPr>
         <w:t xml:space="preserve"> (Código Abierto)</w:t>
       </w:r>
     </w:p>
     <w:sectPr>
-      <w:pgSz w:w="12240" w:h="15840" w:orient="portrait"/>
+      <w:pgSz w:w="12240" w:h="15840"/>
       <w:pgMar w:top="1440" w:right="1440" w:bottom="1440" w:left="1440" w:header="720" w:footer="720" w:gutter="0"/>
       <w:pgNumType w:start="1"/>
       <w:cols w:space="720"/>
@@ -624,10 +509,11 @@
 
 <file path=word/numbering.xml><?xml version="1.0" encoding="utf-8"?>
 <w:numbering xmlns:wpc="http://schemas.microsoft.com/office/word/2010/wordprocessingCanvas" xmlns:cx="http://schemas.microsoft.com/office/drawing/2014/chartex" xmlns:cx1="http://schemas.microsoft.com/office/drawing/2015/9/8/chartex" xmlns:cx2="http://schemas.microsoft.com/office/drawing/2015/10/21/chartex" xmlns:cx3="http://schemas.microsoft.com/office/drawing/2016/5/9/chartex" xmlns:cx4="http://schemas.microsoft.com/office/drawing/2016/5/10/chartex" xmlns:cx5="http://schemas.microsoft.com/office/drawing/2016/5/11/chartex" xmlns:cx6="http://schemas.microsoft.com/office/drawing/2016/5/12/chartex" xmlns:cx7="http://schemas.microsoft.com/office/drawing/2016/5/13/chartex" xmlns:cx8="http://schemas.microsoft.com/office/drawing/2016/5/14/chartex" xmlns:mc="http://schemas.openxmlformats.org/markup-compatibility/2006" xmlns:aink="http://schemas.microsoft.com/office/drawing/2016/ink" xmlns:am3d="http://schemas.microsoft.com/office/drawing/2017/model3d" xmlns:o="urn:schemas-microsoft-com:office:office" xmlns:oel="http://schemas.microsoft.com/office/2019/extlst" xmlns:r="http://schemas.openxmlformats.org/officeDocument/2006/relationships" xmlns:m="http://schemas.openxmlformats.org/officeDocument/2006/math" xmlns:v="urn:schemas-microsoft-com:vml" xmlns:wp14="http://schemas.microsoft.com/office/word/2010/wordprocessingDrawing" xmlns:wp="http://schemas.openxmlformats.org/drawingml/2006/wordprocessingDrawing" xmlns:w10="urn:schemas-microsoft-com:office:word" xmlns:w="http://schemas.openxmlformats.org/wordprocessingml/2006/main" xmlns:w14="http://schemas.microsoft.com/office/word/2010/wordml" xmlns:w15="http://schemas.microsoft.com/office/word/2012/wordml" xmlns:w16cex="http://schemas.microsoft.com/office/word/2018/wordml/cex" xmlns:w16cid="http://schemas.microsoft.com/office/word/2016/wordml/cid" xmlns:w16="http://schemas.microsoft.com/office/word/2018/wordml" xmlns:w16du="http://schemas.microsoft.com/office/word/2023/wordml/word16du" xmlns:w16sdtdh="http://schemas.microsoft.com/office/word/2020/wordml/sdtdatahash" xmlns:w16sdtfl="http://schemas.microsoft.com/office/word/2024/wordml/sdtformatlock" xmlns:w16se="http://schemas.microsoft.com/office/word/2015/wordml/symex" xmlns:wpg="http://schemas.microsoft.com/office/word/2010/wordprocessingGroup" xmlns:wpi="http://schemas.microsoft.com/office/word/2010/wordprocessingInk" xmlns:wne="http://schemas.microsoft.com/office/word/2006/wordml" xmlns:wps="http://schemas.microsoft.com/office/word/2010/wordprocessingShape" mc:Ignorable="w14 w15 w16se w16cid w16 w16cex w16sdtdh w16sdtfl w16du wp14">
-  <w:abstractNum xmlns:w="http://schemas.openxmlformats.org/wordprocessingml/2006/main" w:abstractNumId="1">
-    <w:nsid w:val="69b031a4"/>
-    <w:multiLevelType xmlns:w="http://schemas.openxmlformats.org/wordprocessingml/2006/main" w:val="hybridMultilevel"/>
-    <w:lvl xmlns:w="http://schemas.openxmlformats.org/wordprocessingml/2006/main" w:ilvl="0">
+  <w:abstractNum w:abstractNumId="0" w15:restartNumberingAfterBreak="0">
+    <w:nsid w:val="69B031A4"/>
+    <w:multiLevelType w:val="hybridMultilevel"/>
+    <w:tmpl w:val="9E80FF84"/>
+    <w:lvl w:ilvl="0" w:tplc="2D266AB8">
       <w:start w:val="1"/>
       <w:numFmt w:val="bullet"/>
       <w:lvlText w:val=""/>
@@ -636,10 +522,10 @@
         <w:ind w:left="720" w:hanging="360"/>
       </w:pPr>
       <w:rPr>
-        <w:rFonts w:hint="default" w:ascii="Symbol" w:hAnsi="Symbol"/>
+        <w:rFonts w:ascii="Symbol" w:hAnsi="Symbol" w:hint="default"/>
       </w:rPr>
     </w:lvl>
-    <w:lvl xmlns:w="http://schemas.openxmlformats.org/wordprocessingml/2006/main" w:ilvl="1">
+    <w:lvl w:ilvl="1" w:tplc="979840C6">
       <w:start w:val="1"/>
       <w:numFmt w:val="bullet"/>
       <w:lvlText w:val="o"/>
@@ -648,10 +534,10 @@
         <w:ind w:left="1440" w:hanging="360"/>
       </w:pPr>
       <w:rPr>
-        <w:rFonts w:hint="default" w:ascii="Courier New" w:hAnsi="Courier New"/>
+        <w:rFonts w:ascii="Courier New" w:hAnsi="Courier New" w:hint="default"/>
       </w:rPr>
     </w:lvl>
-    <w:lvl xmlns:w="http://schemas.openxmlformats.org/wordprocessingml/2006/main" w:ilvl="2">
+    <w:lvl w:ilvl="2" w:tplc="7A1AACC6">
       <w:start w:val="1"/>
       <w:numFmt w:val="bullet"/>
       <w:lvlText w:val=""/>
@@ -660,10 +546,10 @@
         <w:ind w:left="2160" w:hanging="360"/>
       </w:pPr>
       <w:rPr>
-        <w:rFonts w:hint="default" w:ascii="Wingdings" w:hAnsi="Wingdings"/>
+        <w:rFonts w:ascii="Wingdings" w:hAnsi="Wingdings" w:hint="default"/>
       </w:rPr>
     </w:lvl>
-    <w:lvl xmlns:w="http://schemas.openxmlformats.org/wordprocessingml/2006/main" w:ilvl="3">
+    <w:lvl w:ilvl="3" w:tplc="CAFCB64E">
       <w:start w:val="1"/>
       <w:numFmt w:val="bullet"/>
       <w:lvlText w:val=""/>
@@ -672,10 +558,10 @@
         <w:ind w:left="2880" w:hanging="360"/>
       </w:pPr>
       <w:rPr>
-        <w:rFonts w:hint="default" w:ascii="Symbol" w:hAnsi="Symbol"/>
+        <w:rFonts w:ascii="Symbol" w:hAnsi="Symbol" w:hint="default"/>
       </w:rPr>
     </w:lvl>
-    <w:lvl xmlns:w="http://schemas.openxmlformats.org/wordprocessingml/2006/main" w:ilvl="4">
+    <w:lvl w:ilvl="4" w:tplc="4EAED850">
       <w:start w:val="1"/>
       <w:numFmt w:val="bullet"/>
       <w:lvlText w:val="o"/>
@@ -684,10 +570,10 @@
         <w:ind w:left="3600" w:hanging="360"/>
       </w:pPr>
       <w:rPr>
-        <w:rFonts w:hint="default" w:ascii="Courier New" w:hAnsi="Courier New"/>
+        <w:rFonts w:ascii="Courier New" w:hAnsi="Courier New" w:hint="default"/>
       </w:rPr>
     </w:lvl>
-    <w:lvl xmlns:w="http://schemas.openxmlformats.org/wordprocessingml/2006/main" w:ilvl="5">
+    <w:lvl w:ilvl="5" w:tplc="FD66F9FE">
       <w:start w:val="1"/>
       <w:numFmt w:val="bullet"/>
       <w:lvlText w:val=""/>
@@ -696,10 +582,10 @@
         <w:ind w:left="4320" w:hanging="360"/>
       </w:pPr>
       <w:rPr>
-        <w:rFonts w:hint="default" w:ascii="Wingdings" w:hAnsi="Wingdings"/>
+        <w:rFonts w:ascii="Wingdings" w:hAnsi="Wingdings" w:hint="default"/>
       </w:rPr>
     </w:lvl>
-    <w:lvl xmlns:w="http://schemas.openxmlformats.org/wordprocessingml/2006/main" w:ilvl="6">
+    <w:lvl w:ilvl="6" w:tplc="12247268">
       <w:start w:val="1"/>
       <w:numFmt w:val="bullet"/>
       <w:lvlText w:val=""/>
@@ -708,10 +594,10 @@
         <w:ind w:left="5040" w:hanging="360"/>
       </w:pPr>
       <w:rPr>
-        <w:rFonts w:hint="default" w:ascii="Symbol" w:hAnsi="Symbol"/>
+        <w:rFonts w:ascii="Symbol" w:hAnsi="Symbol" w:hint="default"/>
       </w:rPr>
     </w:lvl>
-    <w:lvl xmlns:w="http://schemas.openxmlformats.org/wordprocessingml/2006/main" w:ilvl="7">
+    <w:lvl w:ilvl="7" w:tplc="8070C95A">
       <w:start w:val="1"/>
       <w:numFmt w:val="bullet"/>
       <w:lvlText w:val="o"/>
@@ -720,10 +606,10 @@
         <w:ind w:left="5760" w:hanging="360"/>
       </w:pPr>
       <w:rPr>
-        <w:rFonts w:hint="default" w:ascii="Courier New" w:hAnsi="Courier New"/>
+        <w:rFonts w:ascii="Courier New" w:hAnsi="Courier New" w:hint="default"/>
       </w:rPr>
     </w:lvl>
-    <w:lvl xmlns:w="http://schemas.openxmlformats.org/wordprocessingml/2006/main" w:ilvl="8">
+    <w:lvl w:ilvl="8" w:tplc="FBDA7E32">
       <w:start w:val="1"/>
       <w:numFmt w:val="bullet"/>
       <w:lvlText w:val=""/>
@@ -732,11 +618,11 @@
         <w:ind w:left="6480" w:hanging="360"/>
       </w:pPr>
       <w:rPr>
-        <w:rFonts w:hint="default" w:ascii="Wingdings" w:hAnsi="Wingdings"/>
+        <w:rFonts w:ascii="Wingdings" w:hAnsi="Wingdings" w:hint="default"/>
       </w:rPr>
     </w:lvl>
   </w:abstractNum>
-  <w:abstractNum w:abstractNumId="0" w15:restartNumberingAfterBreak="0">
+  <w:abstractNum w:abstractNumId="1" w15:restartNumberingAfterBreak="0">
     <w:nsid w:val="75812CE5"/>
     <w:multiLevelType w:val="multilevel"/>
     <w:tmpl w:val="E3360C7E"/>
@@ -752,7 +638,7 @@
         <w:ind w:left="720" w:hanging="360"/>
       </w:pPr>
       <w:rPr>
-        <w:rFonts w:hint="default" w:ascii="Symbol" w:hAnsi="Symbol"/>
+        <w:rFonts w:ascii="Symbol" w:hAnsi="Symbol" w:hint="default"/>
         <w:sz w:val="20"/>
       </w:rPr>
     </w:lvl>
@@ -768,7 +654,7 @@
         <w:ind w:left="1440" w:hanging="360"/>
       </w:pPr>
       <w:rPr>
-        <w:rFonts w:hint="default" w:ascii="Courier New" w:hAnsi="Courier New"/>
+        <w:rFonts w:ascii="Courier New" w:hAnsi="Courier New" w:hint="default"/>
         <w:sz w:val="20"/>
       </w:rPr>
     </w:lvl>
@@ -784,7 +670,7 @@
         <w:ind w:left="2160" w:hanging="360"/>
       </w:pPr>
       <w:rPr>
-        <w:rFonts w:hint="default" w:ascii="Wingdings" w:hAnsi="Wingdings"/>
+        <w:rFonts w:ascii="Wingdings" w:hAnsi="Wingdings" w:hint="default"/>
         <w:sz w:val="20"/>
       </w:rPr>
     </w:lvl>
@@ -800,7 +686,7 @@
         <w:ind w:left="2880" w:hanging="360"/>
       </w:pPr>
       <w:rPr>
-        <w:rFonts w:hint="default" w:ascii="Wingdings" w:hAnsi="Wingdings"/>
+        <w:rFonts w:ascii="Wingdings" w:hAnsi="Wingdings" w:hint="default"/>
         <w:sz w:val="20"/>
       </w:rPr>
     </w:lvl>
@@ -816,7 +702,7 @@
         <w:ind w:left="3600" w:hanging="360"/>
       </w:pPr>
       <w:rPr>
-        <w:rFonts w:hint="default" w:ascii="Wingdings" w:hAnsi="Wingdings"/>
+        <w:rFonts w:ascii="Wingdings" w:hAnsi="Wingdings" w:hint="default"/>
         <w:sz w:val="20"/>
       </w:rPr>
     </w:lvl>
@@ -832,7 +718,7 @@
         <w:ind w:left="4320" w:hanging="360"/>
       </w:pPr>
       <w:rPr>
-        <w:rFonts w:hint="default" w:ascii="Wingdings" w:hAnsi="Wingdings"/>
+        <w:rFonts w:ascii="Wingdings" w:hAnsi="Wingdings" w:hint="default"/>
         <w:sz w:val="20"/>
       </w:rPr>
     </w:lvl>
@@ -848,7 +734,7 @@
         <w:ind w:left="5040" w:hanging="360"/>
       </w:pPr>
       <w:rPr>
-        <w:rFonts w:hint="default" w:ascii="Wingdings" w:hAnsi="Wingdings"/>
+        <w:rFonts w:ascii="Wingdings" w:hAnsi="Wingdings" w:hint="default"/>
         <w:sz w:val="20"/>
       </w:rPr>
     </w:lvl>
@@ -864,7 +750,7 @@
         <w:ind w:left="5760" w:hanging="360"/>
       </w:pPr>
       <w:rPr>
-        <w:rFonts w:hint="default" w:ascii="Wingdings" w:hAnsi="Wingdings"/>
+        <w:rFonts w:ascii="Wingdings" w:hAnsi="Wingdings" w:hint="default"/>
         <w:sz w:val="20"/>
       </w:rPr>
     </w:lvl>
@@ -880,16 +766,16 @@
         <w:ind w:left="6480" w:hanging="360"/>
       </w:pPr>
       <w:rPr>
-        <w:rFonts w:hint="default" w:ascii="Wingdings" w:hAnsi="Wingdings"/>
+        <w:rFonts w:ascii="Wingdings" w:hAnsi="Wingdings" w:hint="default"/>
         <w:sz w:val="20"/>
       </w:rPr>
     </w:lvl>
   </w:abstractNum>
-  <w:num w:numId="2">
+  <w:num w:numId="1" w16cid:durableId="2036149542">
+    <w:abstractNumId w:val="0"/>
+  </w:num>
+  <w:num w:numId="2" w16cid:durableId="1077485250">
     <w:abstractNumId w:val="1"/>
-  </w:num>
-  <w:num w:numId="1" w16cid:durableId="1077485250">
-    <w:abstractNumId w:val="0"/>
   </w:num>
 </w:numbering>
 </file>
@@ -899,7 +785,7 @@
   <w:docDefaults>
     <w:rPrDefault>
       <w:rPr>
-        <w:rFonts w:ascii="Arial" w:hAnsi="Arial" w:eastAsia="Arial" w:cs="Arial"/>
+        <w:rFonts w:ascii="Arial" w:eastAsia="Arial" w:hAnsi="Arial" w:cs="Arial"/>
         <w:sz w:val="22"/>
         <w:szCs w:val="22"/>
         <w:lang w:val="es-419" w:eastAsia="en-US" w:bidi="ar-SA"/>
@@ -914,14 +800,14 @@
   <w:latentStyles w:defLockedState="0" w:defUIPriority="99" w:defSemiHidden="0" w:defUnhideWhenUsed="0" w:defQFormat="0" w:count="376">
     <w:lsdException w:name="Normal" w:uiPriority="0" w:qFormat="1"/>
     <w:lsdException w:name="heading 1" w:uiPriority="9" w:qFormat="1"/>
-    <w:lsdException w:name="heading 2" w:uiPriority="9" w:semiHidden="1" w:unhideWhenUsed="1" w:qFormat="1"/>
-    <w:lsdException w:name="heading 3" w:uiPriority="9" w:semiHidden="1" w:unhideWhenUsed="1" w:qFormat="1"/>
-    <w:lsdException w:name="heading 4" w:uiPriority="9" w:semiHidden="1" w:unhideWhenUsed="1" w:qFormat="1"/>
-    <w:lsdException w:name="heading 5" w:uiPriority="9" w:semiHidden="1" w:unhideWhenUsed="1" w:qFormat="1"/>
-    <w:lsdException w:name="heading 6" w:uiPriority="9" w:semiHidden="1" w:unhideWhenUsed="1" w:qFormat="1"/>
-    <w:lsdException w:name="heading 7" w:uiPriority="9" w:semiHidden="1" w:unhideWhenUsed="1" w:qFormat="1"/>
-    <w:lsdException w:name="heading 8" w:uiPriority="9" w:semiHidden="1" w:unhideWhenUsed="1" w:qFormat="1"/>
-    <w:lsdException w:name="heading 9" w:uiPriority="9" w:semiHidden="1" w:unhideWhenUsed="1" w:qFormat="1"/>
+    <w:lsdException w:name="heading 2" w:semiHidden="1" w:uiPriority="9" w:unhideWhenUsed="1" w:qFormat="1"/>
+    <w:lsdException w:name="heading 3" w:semiHidden="1" w:uiPriority="9" w:unhideWhenUsed="1" w:qFormat="1"/>
+    <w:lsdException w:name="heading 4" w:semiHidden="1" w:uiPriority="9" w:unhideWhenUsed="1" w:qFormat="1"/>
+    <w:lsdException w:name="heading 5" w:semiHidden="1" w:uiPriority="9" w:unhideWhenUsed="1" w:qFormat="1"/>
+    <w:lsdException w:name="heading 6" w:semiHidden="1" w:uiPriority="9" w:unhideWhenUsed="1" w:qFormat="1"/>
+    <w:lsdException w:name="heading 7" w:semiHidden="1" w:uiPriority="9" w:unhideWhenUsed="1" w:qFormat="1"/>
+    <w:lsdException w:name="heading 8" w:semiHidden="1" w:uiPriority="9" w:unhideWhenUsed="1" w:qFormat="1"/>
+    <w:lsdException w:name="heading 9" w:semiHidden="1" w:uiPriority="9" w:unhideWhenUsed="1" w:qFormat="1"/>
     <w:lsdException w:name="index 1" w:semiHidden="1" w:unhideWhenUsed="1"/>
     <w:lsdException w:name="index 2" w:semiHidden="1" w:unhideWhenUsed="1"/>
     <w:lsdException w:name="index 3" w:semiHidden="1" w:unhideWhenUsed="1"/>
@@ -931,22 +817,22 @@
     <w:lsdException w:name="index 7" w:semiHidden="1" w:unhideWhenUsed="1"/>
     <w:lsdException w:name="index 8" w:semiHidden="1" w:unhideWhenUsed="1"/>
     <w:lsdException w:name="index 9" w:semiHidden="1" w:unhideWhenUsed="1"/>
-    <w:lsdException w:name="toc 1" w:uiPriority="39" w:semiHidden="1" w:unhideWhenUsed="1"/>
-    <w:lsdException w:name="toc 2" w:uiPriority="39" w:semiHidden="1" w:unhideWhenUsed="1"/>
-    <w:lsdException w:name="toc 3" w:uiPriority="39" w:semiHidden="1" w:unhideWhenUsed="1"/>
-    <w:lsdException w:name="toc 4" w:uiPriority="39" w:semiHidden="1" w:unhideWhenUsed="1"/>
-    <w:lsdException w:name="toc 5" w:uiPriority="39" w:semiHidden="1" w:unhideWhenUsed="1"/>
-    <w:lsdException w:name="toc 6" w:uiPriority="39" w:semiHidden="1" w:unhideWhenUsed="1"/>
-    <w:lsdException w:name="toc 7" w:uiPriority="39" w:semiHidden="1" w:unhideWhenUsed="1"/>
-    <w:lsdException w:name="toc 8" w:uiPriority="39" w:semiHidden="1" w:unhideWhenUsed="1"/>
-    <w:lsdException w:name="toc 9" w:uiPriority="39" w:semiHidden="1" w:unhideWhenUsed="1"/>
+    <w:lsdException w:name="toc 1" w:semiHidden="1" w:uiPriority="39" w:unhideWhenUsed="1"/>
+    <w:lsdException w:name="toc 2" w:semiHidden="1" w:uiPriority="39" w:unhideWhenUsed="1"/>
+    <w:lsdException w:name="toc 3" w:semiHidden="1" w:uiPriority="39" w:unhideWhenUsed="1"/>
+    <w:lsdException w:name="toc 4" w:semiHidden="1" w:uiPriority="39" w:unhideWhenUsed="1"/>
+    <w:lsdException w:name="toc 5" w:semiHidden="1" w:uiPriority="39" w:unhideWhenUsed="1"/>
+    <w:lsdException w:name="toc 6" w:semiHidden="1" w:uiPriority="39" w:unhideWhenUsed="1"/>
+    <w:lsdException w:name="toc 7" w:semiHidden="1" w:uiPriority="39" w:unhideWhenUsed="1"/>
+    <w:lsdException w:name="toc 8" w:semiHidden="1" w:uiPriority="39" w:unhideWhenUsed="1"/>
+    <w:lsdException w:name="toc 9" w:semiHidden="1" w:uiPriority="39" w:unhideWhenUsed="1"/>
     <w:lsdException w:name="Normal Indent" w:semiHidden="1" w:unhideWhenUsed="1"/>
     <w:lsdException w:name="footnote text" w:semiHidden="1" w:unhideWhenUsed="1"/>
     <w:lsdException w:name="annotation text" w:semiHidden="1" w:unhideWhenUsed="1"/>
     <w:lsdException w:name="header" w:semiHidden="1" w:unhideWhenUsed="1"/>
     <w:lsdException w:name="footer" w:semiHidden="1" w:unhideWhenUsed="1"/>
     <w:lsdException w:name="index heading" w:semiHidden="1" w:unhideWhenUsed="1"/>
-    <w:lsdException w:name="caption" w:uiPriority="35" w:semiHidden="1" w:unhideWhenUsed="1" w:qFormat="1"/>
+    <w:lsdException w:name="caption" w:semiHidden="1" w:uiPriority="35" w:unhideWhenUsed="1" w:qFormat="1"/>
     <w:lsdException w:name="table of figures" w:semiHidden="1" w:unhideWhenUsed="1"/>
     <w:lsdException w:name="envelope address" w:semiHidden="1" w:unhideWhenUsed="1"/>
     <w:lsdException w:name="envelope return" w:semiHidden="1" w:unhideWhenUsed="1"/>
@@ -977,7 +863,7 @@
     <w:lsdException w:name="Title" w:uiPriority="10" w:qFormat="1"/>
     <w:lsdException w:name="Closing" w:semiHidden="1" w:unhideWhenUsed="1"/>
     <w:lsdException w:name="Signature" w:semiHidden="1" w:unhideWhenUsed="1"/>
-    <w:lsdException w:name="Default Paragraph Font" w:uiPriority="1" w:semiHidden="1" w:unhideWhenUsed="1"/>
+    <w:lsdException w:name="Default Paragraph Font" w:semiHidden="1" w:uiPriority="1" w:unhideWhenUsed="1"/>
     <w:lsdException w:name="Body Text" w:semiHidden="1" w:unhideWhenUsed="1"/>
     <w:lsdException w:name="Body Text Indent" w:semiHidden="1" w:unhideWhenUsed="1"/>
     <w:lsdException w:name="List Continue" w:semiHidden="1" w:unhideWhenUsed="1"/>
@@ -1177,8 +1063,8 @@
     <w:lsdException w:name="Subtle Reference" w:uiPriority="31" w:qFormat="1"/>
     <w:lsdException w:name="Intense Reference" w:uiPriority="32" w:qFormat="1"/>
     <w:lsdException w:name="Book Title" w:uiPriority="33" w:qFormat="1"/>
-    <w:lsdException w:name="Bibliography" w:uiPriority="37" w:semiHidden="1" w:unhideWhenUsed="1"/>
-    <w:lsdException w:name="TOC Heading" w:uiPriority="39" w:semiHidden="1" w:unhideWhenUsed="1" w:qFormat="1"/>
+    <w:lsdException w:name="Bibliography" w:semiHidden="1" w:uiPriority="37" w:unhideWhenUsed="1"/>
+    <w:lsdException w:name="TOC Heading" w:semiHidden="1" w:uiPriority="39" w:unhideWhenUsed="1" w:qFormat="1"/>
     <w:lsdException w:name="Plain Table 1" w:uiPriority="41"/>
     <w:lsdException w:name="Plain Table 2" w:uiPriority="42"/>
     <w:lsdException w:name="Plain Table 3" w:uiPriority="43"/>
@@ -1289,7 +1175,7 @@
     <w:lsdException w:name="Unresolved Mention" w:semiHidden="1" w:unhideWhenUsed="1"/>
     <w:lsdException w:name="Smart Link" w:semiHidden="1" w:unhideWhenUsed="1"/>
   </w:latentStyles>
-  <w:style w:type="paragraph" w:styleId="Normal" w:default="1">
+  <w:style w:type="paragraph" w:default="1" w:styleId="Normal">
     <w:name w:val="Normal"/>
     <w:qFormat/>
   </w:style>
@@ -1407,12 +1293,12 @@
       <w:color w:val="666666"/>
     </w:rPr>
   </w:style>
-  <w:style w:type="character" w:styleId="Fuentedeprrafopredeter" w:default="1">
+  <w:style w:type="character" w:default="1" w:styleId="Fuentedeprrafopredeter">
     <w:name w:val="Default Paragraph Font"/>
     <w:uiPriority w:val="1"/>
     <w:unhideWhenUsed/>
   </w:style>
-  <w:style w:type="table" w:styleId="Tablanormal" w:default="1">
+  <w:style w:type="table" w:default="1" w:styleId="Tablanormal">
     <w:name w:val="Normal Table"/>
     <w:uiPriority w:val="99"/>
     <w:semiHidden/>
@@ -1427,13 +1313,13 @@
       </w:tblCellMar>
     </w:tblPr>
   </w:style>
-  <w:style w:type="numbering" w:styleId="Sinlista" w:default="1">
+  <w:style w:type="numbering" w:default="1" w:styleId="Sinlista">
     <w:name w:val="No List"/>
     <w:uiPriority w:val="99"/>
     <w:semiHidden/>
     <w:unhideWhenUsed/>
   </w:style>
-  <w:style w:type="table" w:styleId="TableNormal" w:customStyle="1">
+  <w:style w:type="table" w:customStyle="1" w:styleId="TableNormal">
     <w:name w:val="TableNormal"/>
     <w:tblPr>
       <w:tblCellMar>
@@ -1512,14 +1398,13 @@
       <w:u w:val="single"/>
     </w:rPr>
   </w:style>
-  <w:style w:type="paragraph" w:styleId="ListParagraph">
-    <w:uiPriority w:val="34"/>
+  <w:style w:type="paragraph" w:styleId="Prrafodelista">
     <w:name w:val="List Paragraph"/>
     <w:basedOn w:val="Normal"/>
+    <w:uiPriority w:val="34"/>
     <w:qFormat/>
     <w:rsid w:val="14735F8E"/>
     <w:pPr>
-      <w:spacing/>
       <w:ind w:left="720"/>
       <w:contextualSpacing/>
     </w:pPr>

</xml_diff>